<commit_message>
feat(architecture): LegalEstate 2.0 pipeline, deal passport standard and cross-document matrix
</commit_message>
<xml_diff>
--- a/deals/05_Финошина_Ветошкина_Шатрова/готовые/2026_10_19_Ветошкина_Шатрова_Основной_договор_с_распиской.docx
+++ b/deals/05_Финошина_Ветошкина_Шатрова/готовые/2026_10_19_Ветошкина_Шатрова_Основной_договор_с_распиской.docx
@@ -505,46 +505,7 @@
         </w:rPr>
       </w:pPr>
       <w:r>
-        <w:rPr>
-          <w:rFonts w:ascii="Times New Roman" w:hAnsi="Times New Roman"/>
-          <w:sz w:val="20"/>
-          <w:lang w:val="ru-RU"/>
-        </w:rPr>
-        <w:t>1.4. На момент подписания настоящего Договора отчуждаемый «Объект» находится в залоге у ПАО Сбербанк в обеспечение исполнения обязательст</w:t>
-      </w:r>
-      <w:r>
-        <w:rPr>
-          <w:rFonts w:ascii="Times New Roman" w:hAnsi="Times New Roman"/>
-          <w:sz w:val="20"/>
-          <w:lang w:val="ru-RU"/>
-        </w:rPr>
-        <w:t xml:space="preserve">в </w:t>
-      </w:r>
-      <w:proofErr w:type="spellStart"/>
-      <w:r>
-        <w:rPr>
-          <w:rFonts w:ascii="Times New Roman" w:hAnsi="Times New Roman"/>
-          <w:sz w:val="20"/>
-          <w:lang w:val="ru-RU"/>
-        </w:rPr>
-        <w:t>Ветошкиной</w:t>
-      </w:r>
-      <w:proofErr w:type="spellEnd"/>
-      <w:r>
-        <w:rPr>
-          <w:rFonts w:ascii="Times New Roman" w:hAnsi="Times New Roman"/>
-          <w:sz w:val="20"/>
-          <w:lang w:val="ru-RU"/>
-        </w:rPr>
-        <w:t xml:space="preserve"> Ирины Борисовны по Кредитному договору № 68669730 от 29.09.2023 г., заключенному с Публичным акционерным обществом «Сбербанк России» (ИНН 7707083893, ОГРН 1027700132195, адрес: 117312, г. Москва, ул. Вавилова, д. 19), о чем в ЕГРН сделана запи</w:t>
-      </w:r>
-      <w:r>
-        <w:rPr>
-          <w:rFonts w:ascii="Times New Roman" w:hAnsi="Times New Roman"/>
-          <w:sz w:val="20"/>
-          <w:lang w:val="ru-RU"/>
-        </w:rPr>
-        <w:t>сь об ограничении (обременении) права: Ипотека в силу закона № 58:29:1008003:5108-58/059/2023-4 от 02.10.2023 г. Отчуждение «Объекта» производится с предварительного согласия Залогодержателя – ПАО Сбербанк.</w:t>
+        <w:t>1.4. На момент подписания настоящего Договора отчуждаемый «Объект» находится в залоге у ПАО Сбербанк в обеспечение исполнения обязательств Ветошкиной Ирины Борисовны по Кредитному договору № 68669730 от 29.09.2023 г., заключенному с Публичным акционерным обществом «Сбербанк России» (ИНН ___________, ОГРН 1027700132195, адрес: 117312, г. Москва, ул. Вавилова, д. 19), о чем в ЕГРН сделана запись об ограничении (обременении) права: Ипотека в силу закона № 58:29:1008003:5108-58/059/2023-4 от 02.10.2023 г. Отчуждение «Объекта» производится с предварительного согласия Залогодержателя – ПАО Сбербанк.</w:t>
       </w:r>
     </w:p>
     <w:p>
@@ -952,14 +913,7 @@
         <w:jc w:val="both"/>
       </w:pPr>
       <w:r>
-        <w:rPr>
-          <w:rFonts w:ascii="Times New Roman" w:hAnsi="Times New Roman" w:cs="Times New Roman"/>
-          <w:b w:val="0"/>
-          <w:i w:val="0"/>
-          <w:sz w:val="20"/>
-          <w:lang w:val="ru-RU"/>
-        </w:rPr>
-        <w:t>• Владелец счёта (получатель): Орнатский Олег Александрович;</w:t>
+        <w:t>• Владелец счёта (получатель): [ФИО Продавца / Ветошкина И.Б.];</w:t>
       </w:r>
     </w:p>
     <w:p>
@@ -969,14 +923,7 @@
         <w:jc w:val="both"/>
       </w:pPr>
       <w:r>
-        <w:rPr>
-          <w:rFonts w:ascii="Times New Roman" w:hAnsi="Times New Roman" w:cs="Times New Roman"/>
-          <w:b w:val="0"/>
-          <w:i w:val="0"/>
-          <w:sz w:val="20"/>
-          <w:lang w:val="ru-RU"/>
-        </w:rPr>
-        <w:t>• Номер лицевого счёта: 42307 810 9 4800 0614234 (Универсальный на 5 лет);</w:t>
+        <w:t>• Номер лицевого счёта: ____________________ (Универсальный на 5 лет);</w:t>
       </w:r>
     </w:p>
     <w:p>
@@ -986,14 +933,7 @@
         <w:jc w:val="both"/>
       </w:pPr>
       <w:r>
-        <w:rPr>
-          <w:rFonts w:ascii="Times New Roman" w:hAnsi="Times New Roman" w:cs="Times New Roman"/>
-          <w:b w:val="0"/>
-          <w:i w:val="0"/>
-          <w:sz w:val="20"/>
-          <w:lang w:val="ru-RU"/>
-        </w:rPr>
-        <w:t>• Банк получателя: КУРСКОЕ ОТДЕЛЕНИЕ N8596 ПАО СБЕРБАНК;</w:t>
+        <w:t>• Банк получателя: ПАО Сбербанк;</w:t>
       </w:r>
     </w:p>
     <w:p>
@@ -1003,14 +943,7 @@
         <w:jc w:val="both"/>
       </w:pPr>
       <w:r>
-        <w:rPr>
-          <w:rFonts w:ascii="Times New Roman" w:hAnsi="Times New Roman" w:cs="Times New Roman"/>
-          <w:b w:val="0"/>
-          <w:i w:val="0"/>
-          <w:sz w:val="20"/>
-          <w:lang w:val="ru-RU"/>
-        </w:rPr>
-        <w:t>• БИК: 043807606;</w:t>
+        <w:t>• БИК: ___________;</w:t>
       </w:r>
     </w:p>
     <w:p>
@@ -1020,14 +953,7 @@
         <w:jc w:val="both"/>
       </w:pPr>
       <w:r>
-        <w:rPr>
-          <w:rFonts w:ascii="Times New Roman" w:hAnsi="Times New Roman" w:cs="Times New Roman"/>
-          <w:b w:val="0"/>
-          <w:i w:val="0"/>
-          <w:sz w:val="20"/>
-          <w:lang w:val="ru-RU"/>
-        </w:rPr>
-        <w:t>• Корреспондентский счёт: 30101 810 3 0000 0000606;</w:t>
+        <w:t>• Корреспондентский счёт: ____________________;</w:t>
       </w:r>
     </w:p>
     <w:p>
@@ -1037,14 +963,7 @@
         <w:jc w:val="both"/>
       </w:pPr>
       <w:r>
-        <w:rPr>
-          <w:rFonts w:ascii="Times New Roman" w:hAnsi="Times New Roman" w:cs="Times New Roman"/>
-          <w:b w:val="0"/>
-          <w:i w:val="0"/>
-          <w:sz w:val="20"/>
-          <w:lang w:val="ru-RU"/>
-        </w:rPr>
-        <w:t>• ИНН: 7707083893, КПП: 583402001;</w:t>
+        <w:t>• ИНН: ___________, КПП: ___________;</w:t>
       </w:r>
     </w:p>
     <w:p>
@@ -1641,14 +1560,7 @@
         <w:jc w:val="left"/>
       </w:pPr>
       <w:r>
-        <w:rPr>
-          <w:rFonts w:ascii="Times New Roman" w:hAnsi="Times New Roman" w:cs="Times New Roman"/>
-          <w:b w:val="0"/>
-          <w:i w:val="0"/>
-          <w:sz w:val="18"/>
-          <w:lang w:val="ru-RU"/>
-        </w:rPr>
-        <w:t>Получатель: Орнатский Олег Александрович</w:t>
+        <w:t>Получатель: [ФИО Продавца / Ветошкина И.Б.]</w:t>
       </w:r>
     </w:p>
     <w:p>
@@ -1659,14 +1571,7 @@
         <w:jc w:val="left"/>
       </w:pPr>
       <w:r>
-        <w:rPr>
-          <w:rFonts w:ascii="Times New Roman" w:hAnsi="Times New Roman" w:cs="Times New Roman"/>
-          <w:b w:val="0"/>
-          <w:i w:val="0"/>
-          <w:sz w:val="18"/>
-          <w:lang w:val="ru-RU"/>
-        </w:rPr>
-        <w:t>Номер лицевого счёта: 42307 810 9 4800 0614234 (Универсальный на 5 лет)</w:t>
+        <w:t>Номер лицевого счёта: ____________________ (Универсальный на 5 лет)</w:t>
       </w:r>
     </w:p>
     <w:p>
@@ -1677,14 +1582,7 @@
         <w:jc w:val="left"/>
       </w:pPr>
       <w:r>
-        <w:rPr>
-          <w:rFonts w:ascii="Times New Roman" w:hAnsi="Times New Roman" w:cs="Times New Roman"/>
-          <w:b w:val="0"/>
-          <w:i w:val="0"/>
-          <w:sz w:val="18"/>
-          <w:lang w:val="ru-RU"/>
-        </w:rPr>
-        <w:t>Банк получателя: КУРСКОЕ ОТДЕЛЕНИЕ N8596 ПАО СБЕРБАНК</w:t>
+        <w:t>Банк получателя: ПАО Сбербанк</w:t>
       </w:r>
     </w:p>
     <w:p>
@@ -1695,14 +1593,7 @@
         <w:jc w:val="left"/>
       </w:pPr>
       <w:r>
-        <w:rPr>
-          <w:rFonts w:ascii="Times New Roman" w:hAnsi="Times New Roman" w:cs="Times New Roman"/>
-          <w:b w:val="0"/>
-          <w:i w:val="0"/>
-          <w:sz w:val="18"/>
-          <w:lang w:val="ru-RU"/>
-        </w:rPr>
-        <w:t>БИК: 043807606, Корр. счёт: 30101 810 3 0000 0000606, ИНН: 7707083893, КПП: 583402001, Код подр. (ТБ/ОСБ/ВСП): 54/8624/00014 (г. Пенза, ул. Кижеватова, 8)</w:t>
+        <w:t>БИК: ___________, Корр. счёт: ____________________, ИНН: ___________, КПП: ___________, Код подр. (ТБ/ОСБ/ВСП): 54/8624/00014 (г. Пенза, ул. Кижеватова, 8)</w:t>
       </w:r>
     </w:p>
     <w:p>

</xml_diff>